<commit_message>
Rà soát tổng thể 02/9/2026: sd-vlncn 2026.9.2, vbhc-vn 2.12.0, kho 1.10.2, hl 1.4.1, hnh 1.8.4, kccn 1.22.2
- Thống nhất thẩm quyền/người ký GP sử dụng VLNCN sau QĐ 2867 (GP-SCT, PGĐ Thuân)
- Nơi nộp TTHC motcua-tthc.moit.gov.vn (quy tắc bất biến 21 vbhc-vn; sửa hnh, hl)
- Quốc hiệu CỘNG HÒA + en dash: script fix_quoc_hieu.py, qa_all.py QUOCHIEU/KINHGUI, chuẩn hóa 19 mẫu thật
- marketplace 4.11.14
</commit_message>
<xml_diff>
--- a/vbhc-vn/skills/vbhc-vn/examples/sct/bien-ban-lam-viec-lien-nganh-ccn.docx
+++ b/vbhc-vn/skills/vbhc-vn/examples/sct/bien-ban-lam-viec-lien-nganh-ccn.docx
@@ -15,7 +15,7 @@
           <w:b/>
           <w:szCs w:val="28"/>
         </w:rPr>
-        <w:t>CỘNG HOÀ XÃ HỘI CHỦ NGHĨA VIỆT NAM</w:t>
+        <w:t>CỘNG HÒA XÃ HỘI CHỦ NGHĨA VIỆT NAM</w:t>
       </w:r>
     </w:p>
     <w:p>
@@ -99,7 +99,7 @@
           <w:b/>
           <w:szCs w:val="28"/>
         </w:rPr>
-        <w:t>Độc lập - Tự do - Hạnh phúc</w:t>
+        <w:t>Độc lập – Tự do – Hạnh phúc</w:t>
       </w:r>
     </w:p>
     <w:p>

</xml_diff>